<commit_message>
Preparacion de documento entregable
</commit_message>
<xml_diff>
--- a/Captura del pop-Respuesta.docx
+++ b/Captura del pop-Respuesta.docx
@@ -13,11 +13,15 @@
         <w:br/>
       </w:r>
       <w:r>
+        <w:rPr>
+          <w:noProof/>
+        </w:rPr>
+        <w:lastRenderedPageBreak/>
         <w:drawing>
-          <wp:inline distT="0" distB="0" distL="0" distR="0" wp14:anchorId="684F177A" wp14:editId="538136BB">
-            <wp:extent cx="5612130" cy="3721735"/>
-            <wp:effectExtent l="0" t="0" r="7620" b="0"/>
-            <wp:docPr id="1400492822" name="Imagen 1"/>
+          <wp:inline distT="0" distB="0" distL="0" distR="0" wp14:anchorId="11DEF248" wp14:editId="29B1F05F">
+            <wp:extent cx="5029284" cy="8862060"/>
+            <wp:effectExtent l="0" t="0" r="0" b="0"/>
+            <wp:docPr id="1045498011" name="Imagen 1"/>
             <wp:cNvGraphicFramePr>
               <a:graphicFrameLocks xmlns:a="http://schemas.openxmlformats.org/drawingml/2006/main" noChangeAspect="1"/>
             </wp:cNvGraphicFramePr>
@@ -25,23 +29,36 @@
               <a:graphicData uri="http://schemas.openxmlformats.org/drawingml/2006/picture">
                 <pic:pic xmlns:pic="http://schemas.openxmlformats.org/drawingml/2006/picture">
                   <pic:nvPicPr>
-                    <pic:cNvPr id="1400492822" name=""/>
-                    <pic:cNvPicPr/>
+                    <pic:cNvPr id="0" name="Picture 1"/>
+                    <pic:cNvPicPr>
+                      <a:picLocks noChangeAspect="1" noChangeArrowheads="1"/>
+                    </pic:cNvPicPr>
                   </pic:nvPicPr>
                   <pic:blipFill>
-                    <a:blip r:embed="rId4"/>
+                    <a:blip r:embed="rId4">
+                      <a:extLst>
+                        <a:ext uri="{28A0092B-C50C-407E-A947-70E740481C1C}">
+                          <a14:useLocalDpi xmlns:a14="http://schemas.microsoft.com/office/drawing/2010/main" val="0"/>
+                        </a:ext>
+                      </a:extLst>
+                    </a:blip>
+                    <a:srcRect/>
                     <a:stretch>
                       <a:fillRect/>
                     </a:stretch>
                   </pic:blipFill>
-                  <pic:spPr>
+                  <pic:spPr bwMode="auto">
                     <a:xfrm>
                       <a:off x="0" y="0"/>
-                      <a:ext cx="5612130" cy="3721735"/>
+                      <a:ext cx="5031780" cy="8866458"/>
                     </a:xfrm>
                     <a:prstGeom prst="rect">
                       <a:avLst/>
                     </a:prstGeom>
+                    <a:noFill/>
+                    <a:ln>
+                      <a:noFill/>
+                    </a:ln>
                   </pic:spPr>
                 </pic:pic>
               </a:graphicData>
@@ -686,6 +703,7 @@
   <w:style w:type="character" w:default="1" w:styleId="Fuentedeprrafopredeter">
     <w:name w:val="Default Paragraph Font"/>
     <w:uiPriority w:val="1"/>
+    <w:semiHidden/>
     <w:unhideWhenUsed/>
   </w:style>
   <w:style w:type="table" w:default="1" w:styleId="Tablanormal">

</xml_diff>